<commit_message>
Update Q-Sys files and remove obsolete controls
Added new compiled and designer files, updated help documents, and removed obsolete Qsys Generic LevelMute Named Control files. This streamlines the module and aligns documentation and test files with the latest changes.
</commit_message>
<xml_diff>
--- a/SIMPL/Qsys Core Help File.docx
+++ b/SIMPL/Qsys Core Help File.docx
@@ -118,7 +118,6 @@
                 <w:szCs w:val="24"/>
               </w:rPr>
             </w:pPr>
-            <w:proofErr w:type="spellStart"/>
             <w:r>
               <w:rPr>
                 <w:rFonts w:ascii="Verdana" w:hAnsi="Verdana"/>
@@ -126,17 +125,7 @@
                 <w:sz w:val="15"/>
                 <w:szCs w:val="24"/>
               </w:rPr>
-              <w:t>Qsys</w:t>
-            </w:r>
-            <w:proofErr w:type="spellEnd"/>
-            <w:r>
-              <w:rPr>
-                <w:rFonts w:ascii="Verdana" w:hAnsi="Verdana"/>
-                <w:color w:val="000000"/>
-                <w:sz w:val="15"/>
-                <w:szCs w:val="24"/>
-              </w:rPr>
-              <w:t xml:space="preserve"> Core</w:t>
+              <w:t>Qsys Core</w:t>
             </w:r>
           </w:p>
         </w:tc>
@@ -193,7 +182,6 @@
                 <w:szCs w:val="24"/>
               </w:rPr>
             </w:pPr>
-            <w:proofErr w:type="spellStart"/>
             <w:r>
               <w:rPr>
                 <w:rFonts w:ascii="Verdana" w:hAnsi="Verdana"/>
@@ -203,7 +191,6 @@
               </w:rPr>
               <w:t>Qsys</w:t>
             </w:r>
-            <w:proofErr w:type="spellEnd"/>
           </w:p>
         </w:tc>
       </w:tr>
@@ -282,7 +269,16 @@
                 <w:sz w:val="15"/>
                 <w:szCs w:val="24"/>
               </w:rPr>
-              <w:t>3.1</w:t>
+              <w:t>3.</w:t>
+            </w:r>
+            <w:r>
+              <w:rPr>
+                <w:rFonts w:ascii="Verdana" w:hAnsi="Verdana"/>
+                <w:color w:val="000000"/>
+                <w:sz w:val="15"/>
+                <w:szCs w:val="24"/>
+              </w:rPr>
+              <w:t>2</w:t>
             </w:r>
           </w:p>
         </w:tc>
@@ -861,87 +857,7 @@
                 <w:sz w:val="16"/>
                 <w:szCs w:val="24"/>
               </w:rPr>
-              <w:t xml:space="preserve"> Pulse this after </w:t>
-            </w:r>
-            <w:proofErr w:type="spellStart"/>
-            <w:r>
-              <w:rPr>
-                <w:rFonts w:ascii="Arial" w:hAnsi="Arial" w:cs="Arial"/>
-                <w:color w:val="000000"/>
-                <w:sz w:val="16"/>
-                <w:szCs w:val="24"/>
-              </w:rPr>
-              <w:t>DeploymentHost</w:t>
-            </w:r>
-            <w:proofErr w:type="spellEnd"/>
-            <w:r>
-              <w:rPr>
-                <w:rFonts w:ascii="Arial" w:hAnsi="Arial" w:cs="Arial"/>
-                <w:color w:val="000000"/>
-                <w:sz w:val="16"/>
-                <w:szCs w:val="24"/>
-              </w:rPr>
-              <w:t xml:space="preserve">, </w:t>
-            </w:r>
-            <w:proofErr w:type="spellStart"/>
-            <w:r>
-              <w:rPr>
-                <w:rFonts w:ascii="Arial" w:hAnsi="Arial" w:cs="Arial"/>
-                <w:color w:val="000000"/>
-                <w:sz w:val="16"/>
-                <w:szCs w:val="24"/>
-              </w:rPr>
-              <w:t>TestingHost</w:t>
-            </w:r>
-            <w:proofErr w:type="spellEnd"/>
-            <w:r>
-              <w:rPr>
-                <w:rFonts w:ascii="Arial" w:hAnsi="Arial" w:cs="Arial"/>
-                <w:color w:val="000000"/>
-                <w:sz w:val="16"/>
-                <w:szCs w:val="24"/>
-              </w:rPr>
-              <w:t xml:space="preserve">, </w:t>
-            </w:r>
-            <w:proofErr w:type="spellStart"/>
-            <w:r>
-              <w:rPr>
-                <w:rFonts w:ascii="Arial" w:hAnsi="Arial" w:cs="Arial"/>
-                <w:color w:val="000000"/>
-                <w:sz w:val="16"/>
-                <w:szCs w:val="24"/>
-              </w:rPr>
-              <w:t>DeploymentMode</w:t>
-            </w:r>
-            <w:proofErr w:type="spellEnd"/>
-            <w:r>
-              <w:rPr>
-                <w:rFonts w:ascii="Arial" w:hAnsi="Arial" w:cs="Arial"/>
-                <w:color w:val="000000"/>
-                <w:sz w:val="16"/>
-                <w:szCs w:val="24"/>
-              </w:rPr>
-              <w:t xml:space="preserve">, and </w:t>
-            </w:r>
-            <w:proofErr w:type="spellStart"/>
-            <w:r>
-              <w:rPr>
-                <w:rFonts w:ascii="Arial" w:hAnsi="Arial" w:cs="Arial"/>
-                <w:color w:val="000000"/>
-                <w:sz w:val="16"/>
-                <w:szCs w:val="24"/>
-              </w:rPr>
-              <w:t>UseExternalConnection</w:t>
-            </w:r>
-            <w:proofErr w:type="spellEnd"/>
-            <w:r>
-              <w:rPr>
-                <w:rFonts w:ascii="Arial" w:hAnsi="Arial" w:cs="Arial"/>
-                <w:color w:val="000000"/>
-                <w:sz w:val="16"/>
-                <w:szCs w:val="24"/>
-              </w:rPr>
-              <w:t xml:space="preserve"> have been set to their desired states.</w:t>
+              <w:t xml:space="preserve"> Pulse this after DeploymentHost, TestingHost, DeploymentMode, and UseExternalConnection have been set to their desired states.</w:t>
             </w:r>
           </w:p>
         </w:tc>
@@ -964,7 +880,6 @@
                 <w:szCs w:val="16"/>
               </w:rPr>
             </w:pPr>
-            <w:proofErr w:type="spellStart"/>
             <w:r>
               <w:rPr>
                 <w:rFonts w:ascii="Arial" w:hAnsi="Arial" w:cs="Arial"/>
@@ -975,7 +890,6 @@
               </w:rPr>
               <w:t>DeploymentHost</w:t>
             </w:r>
-            <w:proofErr w:type="spellEnd"/>
           </w:p>
         </w:tc>
         <w:tc>
@@ -1025,27 +939,7 @@
                 <w:sz w:val="16"/>
                 <w:szCs w:val="24"/>
               </w:rPr>
-              <w:t xml:space="preserve">IP Address or Hostname of the Q-SYS Core to connect to for Deployment. This value will be used when </w:t>
-            </w:r>
-            <w:proofErr w:type="spellStart"/>
-            <w:r>
-              <w:rPr>
-                <w:rFonts w:ascii="Arial" w:hAnsi="Arial" w:cs="Arial"/>
-                <w:color w:val="000000"/>
-                <w:sz w:val="16"/>
-                <w:szCs w:val="24"/>
-              </w:rPr>
-              <w:t>DeploymentMode</w:t>
-            </w:r>
-            <w:proofErr w:type="spellEnd"/>
-            <w:r>
-              <w:rPr>
-                <w:rFonts w:ascii="Arial" w:hAnsi="Arial" w:cs="Arial"/>
-                <w:color w:val="000000"/>
-                <w:sz w:val="16"/>
-                <w:szCs w:val="24"/>
-              </w:rPr>
-              <w:t xml:space="preserve"> is </w:t>
+              <w:t xml:space="preserve">IP Address or Hostname of the Q-SYS Core to connect to for Deployment. This value will be used when DeploymentMode is </w:t>
             </w:r>
             <w:r>
               <w:rPr>
@@ -1094,29 +988,7 @@
                 <w:sz w:val="16"/>
                 <w:szCs w:val="16"/>
               </w:rPr>
-              <w:t>[</w:t>
-            </w:r>
-            <w:proofErr w:type="spellStart"/>
-            <w:r>
-              <w:rPr>
-                <w:rFonts w:ascii="Arial" w:hAnsi="Arial" w:cs="Arial"/>
-                <w:b/>
-                <w:bCs/>
-                <w:sz w:val="16"/>
-                <w:szCs w:val="16"/>
-              </w:rPr>
-              <w:t>TestingHost</w:t>
-            </w:r>
-            <w:proofErr w:type="spellEnd"/>
-            <w:r>
-              <w:rPr>
-                <w:rFonts w:ascii="Arial" w:hAnsi="Arial" w:cs="Arial"/>
-                <w:b/>
-                <w:bCs/>
-                <w:sz w:val="16"/>
-                <w:szCs w:val="16"/>
-              </w:rPr>
-              <w:t>]</w:t>
+              <w:t>[TestingHost]</w:t>
             </w:r>
           </w:p>
         </w:tc>
@@ -1167,27 +1039,7 @@
                 <w:sz w:val="16"/>
                 <w:szCs w:val="24"/>
               </w:rPr>
-              <w:t xml:space="preserve">IP Address or Hostname of the Q-SYS Core to connect to for Testing. This value will be used when </w:t>
-            </w:r>
-            <w:proofErr w:type="spellStart"/>
-            <w:r>
-              <w:rPr>
-                <w:rFonts w:ascii="Arial" w:hAnsi="Arial" w:cs="Arial"/>
-                <w:color w:val="000000"/>
-                <w:sz w:val="16"/>
-                <w:szCs w:val="24"/>
-              </w:rPr>
-              <w:t>DeploymentMode</w:t>
-            </w:r>
-            <w:proofErr w:type="spellEnd"/>
-            <w:r>
-              <w:rPr>
-                <w:rFonts w:ascii="Arial" w:hAnsi="Arial" w:cs="Arial"/>
-                <w:color w:val="000000"/>
-                <w:sz w:val="16"/>
-                <w:szCs w:val="24"/>
-              </w:rPr>
-              <w:t xml:space="preserve"> is </w:t>
+              <w:t xml:space="preserve">IP Address or Hostname of the Q-SYS Core to connect to for Testing. This value will be used when DeploymentMode is </w:t>
             </w:r>
             <w:r>
               <w:rPr>
@@ -1228,7 +1080,6 @@
                 <w:szCs w:val="16"/>
               </w:rPr>
             </w:pPr>
-            <w:proofErr w:type="spellStart"/>
             <w:r>
               <w:rPr>
                 <w:rFonts w:ascii="Arial" w:hAnsi="Arial" w:cs="Arial"/>
@@ -1239,7 +1090,6 @@
               </w:rPr>
               <w:t>DeploymentMode</w:t>
             </w:r>
-            <w:proofErr w:type="spellEnd"/>
           </w:p>
           <w:p>
             <w:pPr>
@@ -1299,27 +1149,7 @@
                 <w:sz w:val="16"/>
                 <w:szCs w:val="24"/>
               </w:rPr>
-              <w:t xml:space="preserve">Specifies whether to use </w:t>
-            </w:r>
-            <w:proofErr w:type="spellStart"/>
-            <w:r>
-              <w:rPr>
-                <w:rFonts w:ascii="Arial" w:hAnsi="Arial" w:cs="Arial"/>
-                <w:color w:val="000000"/>
-                <w:sz w:val="16"/>
-                <w:szCs w:val="24"/>
-              </w:rPr>
-              <w:t>DeploymentHost</w:t>
-            </w:r>
-            <w:proofErr w:type="spellEnd"/>
-            <w:r>
-              <w:rPr>
-                <w:rFonts w:ascii="Arial" w:hAnsi="Arial" w:cs="Arial"/>
-                <w:color w:val="000000"/>
-                <w:sz w:val="16"/>
-                <w:szCs w:val="24"/>
-              </w:rPr>
-              <w:t xml:space="preserve"> or Testing Host. </w:t>
+              <w:t xml:space="preserve">Specifies whether to use DeploymentHost or Testing Host. </w:t>
             </w:r>
           </w:p>
           <w:p>
@@ -1348,19 +1178,8 @@
                 <w:sz w:val="16"/>
                 <w:szCs w:val="24"/>
               </w:rPr>
-              <w:t xml:space="preserve">: </w:t>
-            </w:r>
-            <w:proofErr w:type="spellStart"/>
-            <w:r>
-              <w:rPr>
-                <w:rFonts w:ascii="Arial" w:hAnsi="Arial" w:cs="Arial"/>
-                <w:color w:val="000000"/>
-                <w:sz w:val="16"/>
-                <w:szCs w:val="24"/>
-              </w:rPr>
-              <w:t>DeploymentHost</w:t>
-            </w:r>
-            <w:proofErr w:type="spellEnd"/>
+              <w:t>: DeploymentHost</w:t>
+            </w:r>
           </w:p>
           <w:p>
             <w:pPr>
@@ -1388,19 +1207,8 @@
                 <w:sz w:val="16"/>
                 <w:szCs w:val="24"/>
               </w:rPr>
-              <w:t xml:space="preserve">: </w:t>
-            </w:r>
-            <w:proofErr w:type="spellStart"/>
-            <w:r>
-              <w:rPr>
-                <w:rFonts w:ascii="Arial" w:hAnsi="Arial" w:cs="Arial"/>
-                <w:color w:val="000000"/>
-                <w:sz w:val="16"/>
-                <w:szCs w:val="24"/>
-              </w:rPr>
-              <w:t>TestingHost</w:t>
-            </w:r>
-            <w:proofErr w:type="spellEnd"/>
+              <w:t>: TestingHost</w:t>
+            </w:r>
           </w:p>
         </w:tc>
       </w:tr>
@@ -1656,29 +1464,7 @@
                 <w:sz w:val="16"/>
                 <w:szCs w:val="16"/>
               </w:rPr>
-              <w:t>[</w:t>
-            </w:r>
-            <w:proofErr w:type="spellStart"/>
-            <w:r>
-              <w:rPr>
-                <w:rFonts w:ascii="Arial" w:hAnsi="Arial" w:cs="Arial"/>
-                <w:b/>
-                <w:bCs/>
-                <w:sz w:val="16"/>
-                <w:szCs w:val="16"/>
-              </w:rPr>
-              <w:t>UseExternalConnection</w:t>
-            </w:r>
-            <w:proofErr w:type="spellEnd"/>
-            <w:r>
-              <w:rPr>
-                <w:rFonts w:ascii="Arial" w:hAnsi="Arial" w:cs="Arial"/>
-                <w:b/>
-                <w:bCs/>
-                <w:sz w:val="16"/>
-                <w:szCs w:val="16"/>
-              </w:rPr>
-              <w:t>]</w:t>
+              <w:t>[UseExternalConnection]</w:t>
             </w:r>
           </w:p>
         </w:tc>
@@ -1763,29 +1549,7 @@
                 <w:sz w:val="16"/>
                 <w:szCs w:val="16"/>
               </w:rPr>
-              <w:t>[</w:t>
-            </w:r>
-            <w:proofErr w:type="spellStart"/>
-            <w:r>
-              <w:rPr>
-                <w:rFonts w:ascii="Arial" w:hAnsi="Arial" w:cs="Arial"/>
-                <w:b/>
-                <w:bCs/>
-                <w:sz w:val="16"/>
-                <w:szCs w:val="16"/>
-              </w:rPr>
-              <w:t>ExternalConnectionRx</w:t>
-            </w:r>
-            <w:proofErr w:type="spellEnd"/>
-            <w:r>
-              <w:rPr>
-                <w:rFonts w:ascii="Arial" w:hAnsi="Arial" w:cs="Arial"/>
-                <w:b/>
-                <w:bCs/>
-                <w:sz w:val="16"/>
-                <w:szCs w:val="16"/>
-              </w:rPr>
-              <w:t>]</w:t>
+              <w:t>[ExternalConnectionRx]</w:t>
             </w:r>
           </w:p>
         </w:tc>
@@ -1952,7 +1716,6 @@
               </w:rPr>
               <w:t>[</w:t>
             </w:r>
-            <w:proofErr w:type="spellStart"/>
             <w:r>
               <w:rPr>
                 <w:rFonts w:ascii="Arial" w:hAnsi="Arial" w:cs="Arial"/>
@@ -1963,7 +1726,6 @@
               </w:rPr>
               <w:t>IsInitialized</w:t>
             </w:r>
-            <w:proofErr w:type="spellEnd"/>
             <w:r>
               <w:rPr>
                 <w:rFonts w:ascii="Arial" w:hAnsi="Arial" w:cs="Arial"/>
@@ -2074,29 +1836,7 @@
                 <w:sz w:val="16"/>
                 <w:szCs w:val="16"/>
               </w:rPr>
-              <w:t>[</w:t>
-            </w:r>
-            <w:proofErr w:type="spellStart"/>
-            <w:r>
-              <w:rPr>
-                <w:rFonts w:ascii="Arial" w:hAnsi="Arial" w:cs="Arial"/>
-                <w:b/>
-                <w:bCs/>
-                <w:sz w:val="16"/>
-                <w:szCs w:val="16"/>
-              </w:rPr>
-              <w:t>IsConnected</w:t>
-            </w:r>
-            <w:proofErr w:type="spellEnd"/>
-            <w:r>
-              <w:rPr>
-                <w:rFonts w:ascii="Arial" w:hAnsi="Arial" w:cs="Arial"/>
-                <w:b/>
-                <w:bCs/>
-                <w:sz w:val="16"/>
-                <w:szCs w:val="16"/>
-              </w:rPr>
-              <w:t>]</w:t>
+              <w:t>[IsConnected]</w:t>
             </w:r>
           </w:p>
         </w:tc>
@@ -2181,29 +1921,7 @@
                 <w:sz w:val="16"/>
                 <w:szCs w:val="16"/>
               </w:rPr>
-              <w:t>[</w:t>
-            </w:r>
-            <w:proofErr w:type="spellStart"/>
-            <w:r>
-              <w:rPr>
-                <w:rFonts w:ascii="Arial" w:hAnsi="Arial" w:cs="Arial"/>
-                <w:b/>
-                <w:bCs/>
-                <w:sz w:val="16"/>
-                <w:szCs w:val="16"/>
-              </w:rPr>
-              <w:t>IsLoggedIn</w:t>
-            </w:r>
-            <w:proofErr w:type="spellEnd"/>
-            <w:r>
-              <w:rPr>
-                <w:rFonts w:ascii="Arial" w:hAnsi="Arial" w:cs="Arial"/>
-                <w:b/>
-                <w:bCs/>
-                <w:sz w:val="16"/>
-                <w:szCs w:val="16"/>
-              </w:rPr>
-              <w:t>]</w:t>
+              <w:t>[IsLoggedIn]</w:t>
             </w:r>
           </w:p>
         </w:tc>
@@ -2288,29 +2006,7 @@
                 <w:sz w:val="16"/>
                 <w:szCs w:val="16"/>
               </w:rPr>
-              <w:t>[</w:t>
-            </w:r>
-            <w:proofErr w:type="spellStart"/>
-            <w:r>
-              <w:rPr>
-                <w:rFonts w:ascii="Arial" w:hAnsi="Arial" w:cs="Arial"/>
-                <w:b/>
-                <w:bCs/>
-                <w:sz w:val="16"/>
-                <w:szCs w:val="16"/>
-              </w:rPr>
-              <w:t>IsRedundant</w:t>
-            </w:r>
-            <w:proofErr w:type="spellEnd"/>
-            <w:r>
-              <w:rPr>
-                <w:rFonts w:ascii="Arial" w:hAnsi="Arial" w:cs="Arial"/>
-                <w:b/>
-                <w:bCs/>
-                <w:sz w:val="16"/>
-                <w:szCs w:val="16"/>
-              </w:rPr>
-              <w:t>]</w:t>
+              <w:t>[IsRedundant]</w:t>
             </w:r>
           </w:p>
         </w:tc>
@@ -2392,7 +2088,6 @@
               </w:rPr>
               <w:t>[</w:t>
             </w:r>
-            <w:proofErr w:type="spellStart"/>
             <w:r>
               <w:rPr>
                 <w:rFonts w:ascii="Arial" w:hAnsi="Arial" w:cs="Arial"/>
@@ -2403,7 +2098,6 @@
               </w:rPr>
               <w:t>IsEmulator</w:t>
             </w:r>
-            <w:proofErr w:type="spellEnd"/>
             <w:r>
               <w:rPr>
                 <w:rFonts w:ascii="Arial" w:hAnsi="Arial" w:cs="Arial"/>
@@ -2494,20 +2188,8 @@
                 <w:sz w:val="16"/>
                 <w:szCs w:val="16"/>
               </w:rPr>
-              <w:t>[</w:t>
-            </w:r>
-            <w:proofErr w:type="spellStart"/>
-            <w:r>
-              <w:rPr>
-                <w:rFonts w:ascii="Arial" w:hAnsi="Arial" w:cs="Arial"/>
-                <w:b/>
-                <w:bCs/>
-                <w:sz w:val="16"/>
-                <w:szCs w:val="16"/>
-              </w:rPr>
-              <w:t>DesignName</w:t>
-            </w:r>
-            <w:proofErr w:type="spellEnd"/>
+              <w:t>[DesignName</w:t>
+            </w:r>
             <w:r>
               <w:rPr>
                 <w:rFonts w:ascii="Arial" w:hAnsi="Arial" w:cs="Arial"/>
@@ -2598,29 +2280,7 @@
                 <w:sz w:val="16"/>
                 <w:szCs w:val="16"/>
               </w:rPr>
-              <w:t>[</w:t>
-            </w:r>
-            <w:proofErr w:type="spellStart"/>
-            <w:r>
-              <w:rPr>
-                <w:rFonts w:ascii="Arial" w:hAnsi="Arial" w:cs="Arial"/>
-                <w:b/>
-                <w:bCs/>
-                <w:sz w:val="16"/>
-                <w:szCs w:val="16"/>
-              </w:rPr>
-              <w:t>ExternalConnectionTx</w:t>
-            </w:r>
-            <w:proofErr w:type="spellEnd"/>
-            <w:r>
-              <w:rPr>
-                <w:rFonts w:ascii="Arial" w:hAnsi="Arial" w:cs="Arial"/>
-                <w:b/>
-                <w:bCs/>
-                <w:sz w:val="16"/>
-                <w:szCs w:val="16"/>
-              </w:rPr>
-              <w:t>]</w:t>
+              <w:t>[ExternalConnectionTx]</w:t>
             </w:r>
           </w:p>
         </w:tc>
@@ -2756,7 +2416,6 @@
                 <w:szCs w:val="16"/>
               </w:rPr>
             </w:pPr>
-            <w:proofErr w:type="spellStart"/>
             <w:r>
               <w:rPr>
                 <w:rFonts w:ascii="Arial" w:hAnsi="Arial" w:cs="Arial"/>
@@ -2767,7 +2426,6 @@
               </w:rPr>
               <w:t>CoreID</w:t>
             </w:r>
-            <w:proofErr w:type="spellEnd"/>
           </w:p>
         </w:tc>
         <w:tc>
@@ -3218,30 +2876,28 @@
                 <w:sz w:val="15"/>
                 <w:szCs w:val="24"/>
               </w:rPr>
-              <w:t xml:space="preserve">: 3 Series </w:t>
-            </w:r>
-            <w:proofErr w:type="spellStart"/>
-            <w:r>
+              <w:t>: 3 Series Test.smw</w:t>
+            </w:r>
+          </w:p>
+          <w:p>
+            <w:pPr>
+              <w:spacing w:before="100" w:after="100"/>
               <w:rPr>
                 <w:rFonts w:ascii="Verdana" w:hAnsi="Verdana"/>
                 <w:color w:val="000000"/>
                 <w:sz w:val="15"/>
                 <w:szCs w:val="24"/>
               </w:rPr>
-              <w:t>Test.smw</w:t>
-            </w:r>
-            <w:proofErr w:type="spellEnd"/>
-          </w:p>
-          <w:p>
-            <w:pPr>
-              <w:spacing w:before="100" w:after="100"/>
+            </w:pPr>
+            <w:r>
               <w:rPr>
                 <w:rFonts w:ascii="Verdana" w:hAnsi="Verdana"/>
                 <w:color w:val="000000"/>
                 <w:sz w:val="15"/>
                 <w:szCs w:val="24"/>
               </w:rPr>
-            </w:pPr>
+              <w:t>4-Se</w:t>
+            </w:r>
             <w:r>
               <w:rPr>
                 <w:rFonts w:ascii="Verdana" w:hAnsi="Verdana"/>
@@ -3249,7 +2905,7 @@
                 <w:sz w:val="15"/>
                 <w:szCs w:val="24"/>
               </w:rPr>
-              <w:t>4-Se</w:t>
+              <w:t>r</w:t>
             </w:r>
             <w:r>
               <w:rPr>
@@ -3258,7 +2914,7 @@
                 <w:sz w:val="15"/>
                 <w:szCs w:val="24"/>
               </w:rPr>
-              <w:t>r</w:t>
+              <w:t>ies</w:t>
             </w:r>
             <w:r>
               <w:rPr>
@@ -3267,7 +2923,7 @@
                 <w:sz w:val="15"/>
                 <w:szCs w:val="24"/>
               </w:rPr>
-              <w:t>ies</w:t>
+              <w:t>:</w:t>
             </w:r>
             <w:r>
               <w:rPr>
@@ -3276,7 +2932,7 @@
                 <w:sz w:val="15"/>
                 <w:szCs w:val="24"/>
               </w:rPr>
-              <w:t>:</w:t>
+              <w:t xml:space="preserve"> </w:t>
             </w:r>
             <w:r>
               <w:rPr>
@@ -3285,7 +2941,7 @@
                 <w:sz w:val="15"/>
                 <w:szCs w:val="24"/>
               </w:rPr>
-              <w:t xml:space="preserve"> </w:t>
+              <w:t>4 Series Test</w:t>
             </w:r>
             <w:r>
               <w:rPr>
@@ -3294,28 +2950,8 @@
                 <w:sz w:val="15"/>
                 <w:szCs w:val="24"/>
               </w:rPr>
-              <w:t xml:space="preserve">4 Series </w:t>
-            </w:r>
-            <w:proofErr w:type="spellStart"/>
-            <w:r>
-              <w:rPr>
-                <w:rFonts w:ascii="Verdana" w:hAnsi="Verdana"/>
-                <w:color w:val="000000"/>
-                <w:sz w:val="15"/>
-                <w:szCs w:val="24"/>
-              </w:rPr>
-              <w:t>Test</w:t>
-            </w:r>
-            <w:r>
-              <w:rPr>
-                <w:rFonts w:ascii="Verdana" w:hAnsi="Verdana"/>
-                <w:color w:val="000000"/>
-                <w:sz w:val="15"/>
-                <w:szCs w:val="24"/>
-              </w:rPr>
               <w:t>.smw</w:t>
             </w:r>
-            <w:proofErr w:type="spellEnd"/>
           </w:p>
         </w:tc>
       </w:tr>

</xml_diff>

<commit_message>
Update compiled test and Qsys Core help files
Refreshed the compiled test ZIPs and updated Qsys Core help documentation in both PDF and DOCX formats for Module and SIMPL directories.
</commit_message>
<xml_diff>
--- a/SIMPL/Qsys Core Help File.docx
+++ b/SIMPL/Qsys Core Help File.docx
@@ -251,34 +251,7 @@
                 <w:sz w:val="15"/>
                 <w:szCs w:val="24"/>
               </w:rPr>
-              <w:t>4</w:t>
-            </w:r>
-            <w:r>
-              <w:rPr>
-                <w:rFonts w:ascii="Verdana" w:hAnsi="Verdana"/>
-                <w:color w:val="000000"/>
-                <w:sz w:val="15"/>
-                <w:szCs w:val="24"/>
-              </w:rPr>
-              <w:t>.</w:t>
-            </w:r>
-            <w:r>
-              <w:rPr>
-                <w:rFonts w:ascii="Verdana" w:hAnsi="Verdana"/>
-                <w:color w:val="000000"/>
-                <w:sz w:val="15"/>
-                <w:szCs w:val="24"/>
-              </w:rPr>
-              <w:t>3.</w:t>
-            </w:r>
-            <w:r>
-              <w:rPr>
-                <w:rFonts w:ascii="Verdana" w:hAnsi="Verdana"/>
-                <w:color w:val="000000"/>
-                <w:sz w:val="15"/>
-                <w:szCs w:val="24"/>
-              </w:rPr>
-              <w:t>2</w:t>
+              <w:t>4.4.1</w:t>
             </w:r>
           </w:p>
         </w:tc>

</xml_diff>

<commit_message>
Add version tags to modules
Rename all SIMPL modules to include v4.5.0 version suffix, remove hardcoded #SYMBOL_NAME directives, and update Module and Q-Sys Designer files accordingly.
</commit_message>
<xml_diff>
--- a/SIMPL/Qsys Core Help File.docx
+++ b/SIMPL/Qsys Core Help File.docx
@@ -1,6 +1,6 @@
 
 <file path=word/document.xml><?xml version="1.0" encoding="utf-8"?>
-<w:document xmlns:wpc="http://schemas.microsoft.com/office/word/2010/wordprocessingCanvas" xmlns:cx="http://schemas.microsoft.com/office/drawing/2014/chartex" xmlns:cx1="http://schemas.microsoft.com/office/drawing/2015/9/8/chartex" xmlns:cx2="http://schemas.microsoft.com/office/drawing/2015/10/21/chartex" xmlns:cx3="http://schemas.microsoft.com/office/drawing/2016/5/9/chartex" xmlns:cx4="http://schemas.microsoft.com/office/drawing/2016/5/10/chartex" xmlns:cx5="http://schemas.microsoft.com/office/drawing/2016/5/11/chartex" xmlns:cx6="http://schemas.microsoft.com/office/drawing/2016/5/12/chartex" xmlns:cx7="http://schemas.microsoft.com/office/drawing/2016/5/13/chartex" xmlns:cx8="http://schemas.microsoft.com/office/drawing/2016/5/14/chartex" xmlns:mc="http://schemas.openxmlformats.org/markup-compatibility/2006" xmlns:aink="http://schemas.microsoft.com/office/drawing/2016/ink" xmlns:am3d="http://schemas.microsoft.com/office/drawing/2017/model3d" xmlns:o="urn:schemas-microsoft-com:office:office" xmlns:oel="http://schemas.microsoft.com/office/2019/extlst" xmlns:r="http://schemas.openxmlformats.org/officeDocument/2006/relationships" xmlns:m="http://schemas.openxmlformats.org/officeDocument/2006/math" xmlns:v="urn:schemas-microsoft-com:vml" xmlns:wp14="http://schemas.microsoft.com/office/word/2010/wordprocessingDrawing" xmlns:wp="http://schemas.openxmlformats.org/drawingml/2006/wordprocessingDrawing" xmlns:w10="urn:schemas-microsoft-com:office:word" xmlns:w="http://schemas.openxmlformats.org/wordprocessingml/2006/main" xmlns:w14="http://schemas.microsoft.com/office/word/2010/wordml" xmlns:w15="http://schemas.microsoft.com/office/word/2012/wordml" xmlns:w16cex="http://schemas.microsoft.com/office/word/2018/wordml/cex" xmlns:w16cid="http://schemas.microsoft.com/office/word/2016/wordml/cid" xmlns:w16="http://schemas.microsoft.com/office/word/2018/wordml" xmlns:w16du="http://schemas.microsoft.com/office/word/2023/wordml/word16du" xmlns:w16sdtdh="http://schemas.microsoft.com/office/word/2020/wordml/sdtdatahash" xmlns:w16sdtfl="http://schemas.microsoft.com/office/word/2024/wordml/sdtformatlock" xmlns:w16se="http://schemas.microsoft.com/office/word/2015/wordml/symex" xmlns:wpg="http://schemas.microsoft.com/office/word/2010/wordprocessingGroup" xmlns:wpi="http://schemas.microsoft.com/office/word/2010/wordprocessingInk" xmlns:wne="http://schemas.microsoft.com/office/word/2006/wordml" xmlns:wps="http://schemas.microsoft.com/office/word/2010/wordprocessingShape" mc:Ignorable="w14 w15 w16se w16cid w16 w16cex w16sdtdh w16sdtfl w16du wp14">
+<w:document xmlns:wpc="http://schemas.microsoft.com/office/word/2010/wordprocessingCanvas" xmlns:cx="http://schemas.microsoft.com/office/drawing/2014/chartex" xmlns:cx1="http://schemas.microsoft.com/office/drawing/2015/9/8/chartex" xmlns:cx2="http://schemas.microsoft.com/office/drawing/2015/10/21/chartex" xmlns:cx3="http://schemas.microsoft.com/office/drawing/2016/5/9/chartex" xmlns:cx4="http://schemas.microsoft.com/office/drawing/2016/5/10/chartex" xmlns:cx5="http://schemas.microsoft.com/office/drawing/2016/5/11/chartex" xmlns:cx6="http://schemas.microsoft.com/office/drawing/2016/5/12/chartex" xmlns:cx7="http://schemas.microsoft.com/office/drawing/2016/5/13/chartex" xmlns:cx8="http://schemas.microsoft.com/office/drawing/2016/5/14/chartex" xmlns:mc="http://schemas.openxmlformats.org/markup-compatibility/2006" xmlns:aink="http://schemas.microsoft.com/office/drawing/2016/ink" xmlns:am3d="http://schemas.microsoft.com/office/drawing/2017/model3d" xmlns:o="urn:schemas-microsoft-com:office:office" xmlns:oel="http://schemas.microsoft.com/office/2019/extlst" xmlns:r="http://schemas.openxmlformats.org/officeDocument/2006/relationships" xmlns:m="http://schemas.openxmlformats.org/officeDocument/2006/math" xmlns:v="urn:schemas-microsoft-com:vml" xmlns:wp14="http://schemas.microsoft.com/office/word/2010/wordprocessingDrawing" xmlns:wp="http://schemas.openxmlformats.org/drawingml/2006/wordprocessingDrawing" xmlns:w10="urn:schemas-microsoft-com:office:word" xmlns:w="http://schemas.openxmlformats.org/wordprocessingml/2006/main" xmlns:w14="http://schemas.microsoft.com/office/word/2010/wordml" xmlns:w15="http://schemas.microsoft.com/office/word/2012/wordml" xmlns:w16cei="http://schemas.microsoft.com/office/word/2026/wordml/cei" xmlns:w16cex="http://schemas.microsoft.com/office/word/2018/wordml/cex" xmlns:w16cid="http://schemas.microsoft.com/office/word/2016/wordml/cid" xmlns:w16="http://schemas.microsoft.com/office/word/2018/wordml" xmlns:w16du="http://schemas.microsoft.com/office/word/2023/wordml/word16du" xmlns:w16sdtdh="http://schemas.microsoft.com/office/word/2020/wordml/sdtdatahash" xmlns:w16sdtfl="http://schemas.microsoft.com/office/word/2024/wordml/sdtformatlock" xmlns:w16se="http://schemas.microsoft.com/office/word/2015/wordml/symex" xmlns:wpg="http://schemas.microsoft.com/office/word/2010/wordprocessingGroup" xmlns:wpi="http://schemas.microsoft.com/office/word/2010/wordprocessingInk" xmlns:wne="http://schemas.microsoft.com/office/word/2006/wordml" xmlns:wps="http://schemas.microsoft.com/office/word/2010/wordprocessingShape" mc:Ignorable="w14 w15 w16se w16cid w16 w16cex w16sdtdh w16sdtfl w16du wp14">
   <w:body>
     <w:tbl>
       <w:tblPr>
@@ -251,7 +251,16 @@
                 <w:sz w:val="15"/>
                 <w:szCs w:val="24"/>
               </w:rPr>
-              <w:t>4.4.1</w:t>
+              <w:t>4.</w:t>
+            </w:r>
+            <w:r>
+              <w:rPr>
+                <w:rFonts w:ascii="Verdana" w:hAnsi="Verdana"/>
+                <w:color w:val="000000"/>
+                <w:sz w:val="15"/>
+                <w:szCs w:val="24"/>
+              </w:rPr>
+              <w:t>5.0</w:t>
             </w:r>
           </w:p>
         </w:tc>
@@ -2997,7 +3006,7 @@
 </file>
 
 <file path=word/endnotes.xml><?xml version="1.0" encoding="utf-8"?>
-<w:endnotes xmlns:wpc="http://schemas.microsoft.com/office/word/2010/wordprocessingCanvas" xmlns:cx="http://schemas.microsoft.com/office/drawing/2014/chartex" xmlns:cx1="http://schemas.microsoft.com/office/drawing/2015/9/8/chartex" xmlns:cx2="http://schemas.microsoft.com/office/drawing/2015/10/21/chartex" xmlns:cx3="http://schemas.microsoft.com/office/drawing/2016/5/9/chartex" xmlns:cx4="http://schemas.microsoft.com/office/drawing/2016/5/10/chartex" xmlns:cx5="http://schemas.microsoft.com/office/drawing/2016/5/11/chartex" xmlns:cx6="http://schemas.microsoft.com/office/drawing/2016/5/12/chartex" xmlns:cx7="http://schemas.microsoft.com/office/drawing/2016/5/13/chartex" xmlns:cx8="http://schemas.microsoft.com/office/drawing/2016/5/14/chartex" xmlns:mc="http://schemas.openxmlformats.org/markup-compatibility/2006" xmlns:aink="http://schemas.microsoft.com/office/drawing/2016/ink" xmlns:am3d="http://schemas.microsoft.com/office/drawing/2017/model3d" xmlns:o="urn:schemas-microsoft-com:office:office" xmlns:oel="http://schemas.microsoft.com/office/2019/extlst" xmlns:r="http://schemas.openxmlformats.org/officeDocument/2006/relationships" xmlns:m="http://schemas.openxmlformats.org/officeDocument/2006/math" xmlns:v="urn:schemas-microsoft-com:vml" xmlns:wp14="http://schemas.microsoft.com/office/word/2010/wordprocessingDrawing" xmlns:wp="http://schemas.openxmlformats.org/drawingml/2006/wordprocessingDrawing" xmlns:w10="urn:schemas-microsoft-com:office:word" xmlns:w="http://schemas.openxmlformats.org/wordprocessingml/2006/main" xmlns:w14="http://schemas.microsoft.com/office/word/2010/wordml" xmlns:w15="http://schemas.microsoft.com/office/word/2012/wordml" xmlns:w16cex="http://schemas.microsoft.com/office/word/2018/wordml/cex" xmlns:w16cid="http://schemas.microsoft.com/office/word/2016/wordml/cid" xmlns:w16="http://schemas.microsoft.com/office/word/2018/wordml" xmlns:w16du="http://schemas.microsoft.com/office/word/2023/wordml/word16du" xmlns:w16sdtdh="http://schemas.microsoft.com/office/word/2020/wordml/sdtdatahash" xmlns:w16sdtfl="http://schemas.microsoft.com/office/word/2024/wordml/sdtformatlock" xmlns:w16se="http://schemas.microsoft.com/office/word/2015/wordml/symex" xmlns:wpg="http://schemas.microsoft.com/office/word/2010/wordprocessingGroup" xmlns:wpi="http://schemas.microsoft.com/office/word/2010/wordprocessingInk" xmlns:wne="http://schemas.microsoft.com/office/word/2006/wordml" xmlns:wps="http://schemas.microsoft.com/office/word/2010/wordprocessingShape" mc:Ignorable="w14 w15 w16se w16cid w16 w16cex w16sdtdh w16sdtfl w16du wp14">
+<w:endnotes xmlns:wpc="http://schemas.microsoft.com/office/word/2010/wordprocessingCanvas" xmlns:cx="http://schemas.microsoft.com/office/drawing/2014/chartex" xmlns:cx1="http://schemas.microsoft.com/office/drawing/2015/9/8/chartex" xmlns:cx2="http://schemas.microsoft.com/office/drawing/2015/10/21/chartex" xmlns:cx3="http://schemas.microsoft.com/office/drawing/2016/5/9/chartex" xmlns:cx4="http://schemas.microsoft.com/office/drawing/2016/5/10/chartex" xmlns:cx5="http://schemas.microsoft.com/office/drawing/2016/5/11/chartex" xmlns:cx6="http://schemas.microsoft.com/office/drawing/2016/5/12/chartex" xmlns:cx7="http://schemas.microsoft.com/office/drawing/2016/5/13/chartex" xmlns:cx8="http://schemas.microsoft.com/office/drawing/2016/5/14/chartex" xmlns:mc="http://schemas.openxmlformats.org/markup-compatibility/2006" xmlns:aink="http://schemas.microsoft.com/office/drawing/2016/ink" xmlns:am3d="http://schemas.microsoft.com/office/drawing/2017/model3d" xmlns:o="urn:schemas-microsoft-com:office:office" xmlns:oel="http://schemas.microsoft.com/office/2019/extlst" xmlns:r="http://schemas.openxmlformats.org/officeDocument/2006/relationships" xmlns:m="http://schemas.openxmlformats.org/officeDocument/2006/math" xmlns:v="urn:schemas-microsoft-com:vml" xmlns:wp14="http://schemas.microsoft.com/office/word/2010/wordprocessingDrawing" xmlns:wp="http://schemas.openxmlformats.org/drawingml/2006/wordprocessingDrawing" xmlns:w10="urn:schemas-microsoft-com:office:word" xmlns:w="http://schemas.openxmlformats.org/wordprocessingml/2006/main" xmlns:w14="http://schemas.microsoft.com/office/word/2010/wordml" xmlns:w15="http://schemas.microsoft.com/office/word/2012/wordml" xmlns:w16cei="http://schemas.microsoft.com/office/word/2026/wordml/cei" xmlns:w16cex="http://schemas.microsoft.com/office/word/2018/wordml/cex" xmlns:w16cid="http://schemas.microsoft.com/office/word/2016/wordml/cid" xmlns:w16="http://schemas.microsoft.com/office/word/2018/wordml" xmlns:w16du="http://schemas.microsoft.com/office/word/2023/wordml/word16du" xmlns:w16sdtdh="http://schemas.microsoft.com/office/word/2020/wordml/sdtdatahash" xmlns:w16sdtfl="http://schemas.microsoft.com/office/word/2024/wordml/sdtformatlock" xmlns:w16se="http://schemas.microsoft.com/office/word/2015/wordml/symex" xmlns:wpg="http://schemas.microsoft.com/office/word/2010/wordprocessingGroup" xmlns:wpi="http://schemas.microsoft.com/office/word/2010/wordprocessingInk" xmlns:wne="http://schemas.microsoft.com/office/word/2006/wordml" xmlns:wps="http://schemas.microsoft.com/office/word/2010/wordprocessingShape" mc:Ignorable="w14 w15 w16se w16cid w16 w16cex w16sdtdh w16sdtfl w16du wp14">
   <w:endnote w:type="separator" w:id="-1">
     <w:p>
       <w:r>
@@ -3016,7 +3025,7 @@
 </file>
 
 <file path=word/footer1.xml><?xml version="1.0" encoding="utf-8"?>
-<w:ftr xmlns:wpc="http://schemas.microsoft.com/office/word/2010/wordprocessingCanvas" xmlns:cx="http://schemas.microsoft.com/office/drawing/2014/chartex" xmlns:cx1="http://schemas.microsoft.com/office/drawing/2015/9/8/chartex" xmlns:cx2="http://schemas.microsoft.com/office/drawing/2015/10/21/chartex" xmlns:cx3="http://schemas.microsoft.com/office/drawing/2016/5/9/chartex" xmlns:cx4="http://schemas.microsoft.com/office/drawing/2016/5/10/chartex" xmlns:cx5="http://schemas.microsoft.com/office/drawing/2016/5/11/chartex" xmlns:cx6="http://schemas.microsoft.com/office/drawing/2016/5/12/chartex" xmlns:cx7="http://schemas.microsoft.com/office/drawing/2016/5/13/chartex" xmlns:cx8="http://schemas.microsoft.com/office/drawing/2016/5/14/chartex" xmlns:mc="http://schemas.openxmlformats.org/markup-compatibility/2006" xmlns:aink="http://schemas.microsoft.com/office/drawing/2016/ink" xmlns:am3d="http://schemas.microsoft.com/office/drawing/2017/model3d" xmlns:o="urn:schemas-microsoft-com:office:office" xmlns:oel="http://schemas.microsoft.com/office/2019/extlst" xmlns:r="http://schemas.openxmlformats.org/officeDocument/2006/relationships" xmlns:m="http://schemas.openxmlformats.org/officeDocument/2006/math" xmlns:v="urn:schemas-microsoft-com:vml" xmlns:wp14="http://schemas.microsoft.com/office/word/2010/wordprocessingDrawing" xmlns:wp="http://schemas.openxmlformats.org/drawingml/2006/wordprocessingDrawing" xmlns:w10="urn:schemas-microsoft-com:office:word" xmlns:w="http://schemas.openxmlformats.org/wordprocessingml/2006/main" xmlns:w14="http://schemas.microsoft.com/office/word/2010/wordml" xmlns:w15="http://schemas.microsoft.com/office/word/2012/wordml" xmlns:w16cex="http://schemas.microsoft.com/office/word/2018/wordml/cex" xmlns:w16cid="http://schemas.microsoft.com/office/word/2016/wordml/cid" xmlns:w16="http://schemas.microsoft.com/office/word/2018/wordml" xmlns:w16du="http://schemas.microsoft.com/office/word/2023/wordml/word16du" xmlns:w16sdtdh="http://schemas.microsoft.com/office/word/2020/wordml/sdtdatahash" xmlns:w16sdtfl="http://schemas.microsoft.com/office/word/2024/wordml/sdtformatlock" xmlns:w16se="http://schemas.microsoft.com/office/word/2015/wordml/symex" xmlns:wpg="http://schemas.microsoft.com/office/word/2010/wordprocessingGroup" xmlns:wpi="http://schemas.microsoft.com/office/word/2010/wordprocessingInk" xmlns:wne="http://schemas.microsoft.com/office/word/2006/wordml" xmlns:wps="http://schemas.microsoft.com/office/word/2010/wordprocessingShape" mc:Ignorable="w14 w15 w16se w16cid w16 w16cex w16sdtdh w16sdtfl w16du wp14">
+<w:ftr xmlns:wpc="http://schemas.microsoft.com/office/word/2010/wordprocessingCanvas" xmlns:cx="http://schemas.microsoft.com/office/drawing/2014/chartex" xmlns:cx1="http://schemas.microsoft.com/office/drawing/2015/9/8/chartex" xmlns:cx2="http://schemas.microsoft.com/office/drawing/2015/10/21/chartex" xmlns:cx3="http://schemas.microsoft.com/office/drawing/2016/5/9/chartex" xmlns:cx4="http://schemas.microsoft.com/office/drawing/2016/5/10/chartex" xmlns:cx5="http://schemas.microsoft.com/office/drawing/2016/5/11/chartex" xmlns:cx6="http://schemas.microsoft.com/office/drawing/2016/5/12/chartex" xmlns:cx7="http://schemas.microsoft.com/office/drawing/2016/5/13/chartex" xmlns:cx8="http://schemas.microsoft.com/office/drawing/2016/5/14/chartex" xmlns:mc="http://schemas.openxmlformats.org/markup-compatibility/2006" xmlns:aink="http://schemas.microsoft.com/office/drawing/2016/ink" xmlns:am3d="http://schemas.microsoft.com/office/drawing/2017/model3d" xmlns:o="urn:schemas-microsoft-com:office:office" xmlns:oel="http://schemas.microsoft.com/office/2019/extlst" xmlns:r="http://schemas.openxmlformats.org/officeDocument/2006/relationships" xmlns:m="http://schemas.openxmlformats.org/officeDocument/2006/math" xmlns:v="urn:schemas-microsoft-com:vml" xmlns:wp14="http://schemas.microsoft.com/office/word/2010/wordprocessingDrawing" xmlns:wp="http://schemas.openxmlformats.org/drawingml/2006/wordprocessingDrawing" xmlns:w10="urn:schemas-microsoft-com:office:word" xmlns:w="http://schemas.openxmlformats.org/wordprocessingml/2006/main" xmlns:w14="http://schemas.microsoft.com/office/word/2010/wordml" xmlns:w15="http://schemas.microsoft.com/office/word/2012/wordml" xmlns:w16cei="http://schemas.microsoft.com/office/word/2026/wordml/cei" xmlns:w16cex="http://schemas.microsoft.com/office/word/2018/wordml/cex" xmlns:w16cid="http://schemas.microsoft.com/office/word/2016/wordml/cid" xmlns:w16="http://schemas.microsoft.com/office/word/2018/wordml" xmlns:w16du="http://schemas.microsoft.com/office/word/2023/wordml/word16du" xmlns:w16sdtdh="http://schemas.microsoft.com/office/word/2020/wordml/sdtdatahash" xmlns:w16sdtfl="http://schemas.microsoft.com/office/word/2024/wordml/sdtformatlock" xmlns:w16se="http://schemas.microsoft.com/office/word/2015/wordml/symex" xmlns:wpg="http://schemas.microsoft.com/office/word/2010/wordprocessingGroup" xmlns:wpi="http://schemas.microsoft.com/office/word/2010/wordprocessingInk" xmlns:wne="http://schemas.microsoft.com/office/word/2006/wordml" xmlns:wps="http://schemas.microsoft.com/office/word/2010/wordprocessingShape" mc:Ignorable="w14 w15 w16se w16cid w16 w16cex w16sdtdh w16sdtfl w16du wp14">
   <w:p>
     <w:pPr>
       <w:pStyle w:val="Footer"/>
@@ -3026,7 +3035,7 @@
 </file>
 
 <file path=word/footer2.xml><?xml version="1.0" encoding="utf-8"?>
-<w:ftr xmlns:wpc="http://schemas.microsoft.com/office/word/2010/wordprocessingCanvas" xmlns:cx="http://schemas.microsoft.com/office/drawing/2014/chartex" xmlns:cx1="http://schemas.microsoft.com/office/drawing/2015/9/8/chartex" xmlns:cx2="http://schemas.microsoft.com/office/drawing/2015/10/21/chartex" xmlns:cx3="http://schemas.microsoft.com/office/drawing/2016/5/9/chartex" xmlns:cx4="http://schemas.microsoft.com/office/drawing/2016/5/10/chartex" xmlns:cx5="http://schemas.microsoft.com/office/drawing/2016/5/11/chartex" xmlns:cx6="http://schemas.microsoft.com/office/drawing/2016/5/12/chartex" xmlns:cx7="http://schemas.microsoft.com/office/drawing/2016/5/13/chartex" xmlns:cx8="http://schemas.microsoft.com/office/drawing/2016/5/14/chartex" xmlns:mc="http://schemas.openxmlformats.org/markup-compatibility/2006" xmlns:aink="http://schemas.microsoft.com/office/drawing/2016/ink" xmlns:am3d="http://schemas.microsoft.com/office/drawing/2017/model3d" xmlns:o="urn:schemas-microsoft-com:office:office" xmlns:oel="http://schemas.microsoft.com/office/2019/extlst" xmlns:r="http://schemas.openxmlformats.org/officeDocument/2006/relationships" xmlns:m="http://schemas.openxmlformats.org/officeDocument/2006/math" xmlns:v="urn:schemas-microsoft-com:vml" xmlns:wp14="http://schemas.microsoft.com/office/word/2010/wordprocessingDrawing" xmlns:wp="http://schemas.openxmlformats.org/drawingml/2006/wordprocessingDrawing" xmlns:w10="urn:schemas-microsoft-com:office:word" xmlns:w="http://schemas.openxmlformats.org/wordprocessingml/2006/main" xmlns:w14="http://schemas.microsoft.com/office/word/2010/wordml" xmlns:w15="http://schemas.microsoft.com/office/word/2012/wordml" xmlns:w16cex="http://schemas.microsoft.com/office/word/2018/wordml/cex" xmlns:w16cid="http://schemas.microsoft.com/office/word/2016/wordml/cid" xmlns:w16="http://schemas.microsoft.com/office/word/2018/wordml" xmlns:w16du="http://schemas.microsoft.com/office/word/2023/wordml/word16du" xmlns:w16sdtdh="http://schemas.microsoft.com/office/word/2020/wordml/sdtdatahash" xmlns:w16sdtfl="http://schemas.microsoft.com/office/word/2024/wordml/sdtformatlock" xmlns:w16se="http://schemas.microsoft.com/office/word/2015/wordml/symex" xmlns:wpg="http://schemas.microsoft.com/office/word/2010/wordprocessingGroup" xmlns:wpi="http://schemas.microsoft.com/office/word/2010/wordprocessingInk" xmlns:wne="http://schemas.microsoft.com/office/word/2006/wordml" xmlns:wps="http://schemas.microsoft.com/office/word/2010/wordprocessingShape" mc:Ignorable="w14 w15 w16se w16cid w16 w16cex w16sdtdh w16sdtfl w16du wp14">
+<w:ftr xmlns:wpc="http://schemas.microsoft.com/office/word/2010/wordprocessingCanvas" xmlns:cx="http://schemas.microsoft.com/office/drawing/2014/chartex" xmlns:cx1="http://schemas.microsoft.com/office/drawing/2015/9/8/chartex" xmlns:cx2="http://schemas.microsoft.com/office/drawing/2015/10/21/chartex" xmlns:cx3="http://schemas.microsoft.com/office/drawing/2016/5/9/chartex" xmlns:cx4="http://schemas.microsoft.com/office/drawing/2016/5/10/chartex" xmlns:cx5="http://schemas.microsoft.com/office/drawing/2016/5/11/chartex" xmlns:cx6="http://schemas.microsoft.com/office/drawing/2016/5/12/chartex" xmlns:cx7="http://schemas.microsoft.com/office/drawing/2016/5/13/chartex" xmlns:cx8="http://schemas.microsoft.com/office/drawing/2016/5/14/chartex" xmlns:mc="http://schemas.openxmlformats.org/markup-compatibility/2006" xmlns:aink="http://schemas.microsoft.com/office/drawing/2016/ink" xmlns:am3d="http://schemas.microsoft.com/office/drawing/2017/model3d" xmlns:o="urn:schemas-microsoft-com:office:office" xmlns:oel="http://schemas.microsoft.com/office/2019/extlst" xmlns:r="http://schemas.openxmlformats.org/officeDocument/2006/relationships" xmlns:m="http://schemas.openxmlformats.org/officeDocument/2006/math" xmlns:v="urn:schemas-microsoft-com:vml" xmlns:wp14="http://schemas.microsoft.com/office/word/2010/wordprocessingDrawing" xmlns:wp="http://schemas.openxmlformats.org/drawingml/2006/wordprocessingDrawing" xmlns:w10="urn:schemas-microsoft-com:office:word" xmlns:w="http://schemas.openxmlformats.org/wordprocessingml/2006/main" xmlns:w14="http://schemas.microsoft.com/office/word/2010/wordml" xmlns:w15="http://schemas.microsoft.com/office/word/2012/wordml" xmlns:w16cei="http://schemas.microsoft.com/office/word/2026/wordml/cei" xmlns:w16cex="http://schemas.microsoft.com/office/word/2018/wordml/cex" xmlns:w16cid="http://schemas.microsoft.com/office/word/2016/wordml/cid" xmlns:w16="http://schemas.microsoft.com/office/word/2018/wordml" xmlns:w16du="http://schemas.microsoft.com/office/word/2023/wordml/word16du" xmlns:w16sdtdh="http://schemas.microsoft.com/office/word/2020/wordml/sdtdatahash" xmlns:w16sdtfl="http://schemas.microsoft.com/office/word/2024/wordml/sdtformatlock" xmlns:w16se="http://schemas.microsoft.com/office/word/2015/wordml/symex" xmlns:wpg="http://schemas.microsoft.com/office/word/2010/wordprocessingGroup" xmlns:wpi="http://schemas.microsoft.com/office/word/2010/wordprocessingInk" xmlns:wne="http://schemas.microsoft.com/office/word/2006/wordml" xmlns:wps="http://schemas.microsoft.com/office/word/2010/wordprocessingShape" mc:Ignorable="w14 w15 w16se w16cid w16 w16cex w16sdtdh w16sdtfl w16du wp14">
   <w:p>
     <w:pPr>
       <w:tabs>
@@ -3045,7 +3054,7 @@
 </file>
 
 <file path=word/footer3.xml><?xml version="1.0" encoding="utf-8"?>
-<w:ftr xmlns:wpc="http://schemas.microsoft.com/office/word/2010/wordprocessingCanvas" xmlns:cx="http://schemas.microsoft.com/office/drawing/2014/chartex" xmlns:cx1="http://schemas.microsoft.com/office/drawing/2015/9/8/chartex" xmlns:cx2="http://schemas.microsoft.com/office/drawing/2015/10/21/chartex" xmlns:cx3="http://schemas.microsoft.com/office/drawing/2016/5/9/chartex" xmlns:cx4="http://schemas.microsoft.com/office/drawing/2016/5/10/chartex" xmlns:cx5="http://schemas.microsoft.com/office/drawing/2016/5/11/chartex" xmlns:cx6="http://schemas.microsoft.com/office/drawing/2016/5/12/chartex" xmlns:cx7="http://schemas.microsoft.com/office/drawing/2016/5/13/chartex" xmlns:cx8="http://schemas.microsoft.com/office/drawing/2016/5/14/chartex" xmlns:mc="http://schemas.openxmlformats.org/markup-compatibility/2006" xmlns:aink="http://schemas.microsoft.com/office/drawing/2016/ink" xmlns:am3d="http://schemas.microsoft.com/office/drawing/2017/model3d" xmlns:o="urn:schemas-microsoft-com:office:office" xmlns:oel="http://schemas.microsoft.com/office/2019/extlst" xmlns:r="http://schemas.openxmlformats.org/officeDocument/2006/relationships" xmlns:m="http://schemas.openxmlformats.org/officeDocument/2006/math" xmlns:v="urn:schemas-microsoft-com:vml" xmlns:wp14="http://schemas.microsoft.com/office/word/2010/wordprocessingDrawing" xmlns:wp="http://schemas.openxmlformats.org/drawingml/2006/wordprocessingDrawing" xmlns:w10="urn:schemas-microsoft-com:office:word" xmlns:w="http://schemas.openxmlformats.org/wordprocessingml/2006/main" xmlns:w14="http://schemas.microsoft.com/office/word/2010/wordml" xmlns:w15="http://schemas.microsoft.com/office/word/2012/wordml" xmlns:w16cex="http://schemas.microsoft.com/office/word/2018/wordml/cex" xmlns:w16cid="http://schemas.microsoft.com/office/word/2016/wordml/cid" xmlns:w16="http://schemas.microsoft.com/office/word/2018/wordml" xmlns:w16du="http://schemas.microsoft.com/office/word/2023/wordml/word16du" xmlns:w16sdtdh="http://schemas.microsoft.com/office/word/2020/wordml/sdtdatahash" xmlns:w16sdtfl="http://schemas.microsoft.com/office/word/2024/wordml/sdtformatlock" xmlns:w16se="http://schemas.microsoft.com/office/word/2015/wordml/symex" xmlns:wpg="http://schemas.microsoft.com/office/word/2010/wordprocessingGroup" xmlns:wpi="http://schemas.microsoft.com/office/word/2010/wordprocessingInk" xmlns:wne="http://schemas.microsoft.com/office/word/2006/wordml" xmlns:wps="http://schemas.microsoft.com/office/word/2010/wordprocessingShape" mc:Ignorable="w14 w15 w16se w16cid w16 w16cex w16sdtdh w16sdtfl w16du wp14">
+<w:ftr xmlns:wpc="http://schemas.microsoft.com/office/word/2010/wordprocessingCanvas" xmlns:cx="http://schemas.microsoft.com/office/drawing/2014/chartex" xmlns:cx1="http://schemas.microsoft.com/office/drawing/2015/9/8/chartex" xmlns:cx2="http://schemas.microsoft.com/office/drawing/2015/10/21/chartex" xmlns:cx3="http://schemas.microsoft.com/office/drawing/2016/5/9/chartex" xmlns:cx4="http://schemas.microsoft.com/office/drawing/2016/5/10/chartex" xmlns:cx5="http://schemas.microsoft.com/office/drawing/2016/5/11/chartex" xmlns:cx6="http://schemas.microsoft.com/office/drawing/2016/5/12/chartex" xmlns:cx7="http://schemas.microsoft.com/office/drawing/2016/5/13/chartex" xmlns:cx8="http://schemas.microsoft.com/office/drawing/2016/5/14/chartex" xmlns:mc="http://schemas.openxmlformats.org/markup-compatibility/2006" xmlns:aink="http://schemas.microsoft.com/office/drawing/2016/ink" xmlns:am3d="http://schemas.microsoft.com/office/drawing/2017/model3d" xmlns:o="urn:schemas-microsoft-com:office:office" xmlns:oel="http://schemas.microsoft.com/office/2019/extlst" xmlns:r="http://schemas.openxmlformats.org/officeDocument/2006/relationships" xmlns:m="http://schemas.openxmlformats.org/officeDocument/2006/math" xmlns:v="urn:schemas-microsoft-com:vml" xmlns:wp14="http://schemas.microsoft.com/office/word/2010/wordprocessingDrawing" xmlns:wp="http://schemas.openxmlformats.org/drawingml/2006/wordprocessingDrawing" xmlns:w10="urn:schemas-microsoft-com:office:word" xmlns:w="http://schemas.openxmlformats.org/wordprocessingml/2006/main" xmlns:w14="http://schemas.microsoft.com/office/word/2010/wordml" xmlns:w15="http://schemas.microsoft.com/office/word/2012/wordml" xmlns:w16cei="http://schemas.microsoft.com/office/word/2026/wordml/cei" xmlns:w16cex="http://schemas.microsoft.com/office/word/2018/wordml/cex" xmlns:w16cid="http://schemas.microsoft.com/office/word/2016/wordml/cid" xmlns:w16="http://schemas.microsoft.com/office/word/2018/wordml" xmlns:w16du="http://schemas.microsoft.com/office/word/2023/wordml/word16du" xmlns:w16sdtdh="http://schemas.microsoft.com/office/word/2020/wordml/sdtdatahash" xmlns:w16sdtfl="http://schemas.microsoft.com/office/word/2024/wordml/sdtformatlock" xmlns:w16se="http://schemas.microsoft.com/office/word/2015/wordml/symex" xmlns:wpg="http://schemas.microsoft.com/office/word/2010/wordprocessingGroup" xmlns:wpi="http://schemas.microsoft.com/office/word/2010/wordprocessingInk" xmlns:wne="http://schemas.microsoft.com/office/word/2006/wordml" xmlns:wps="http://schemas.microsoft.com/office/word/2010/wordprocessingShape" mc:Ignorable="w14 w15 w16se w16cid w16 w16cex w16sdtdh w16sdtfl w16du wp14">
   <w:p>
     <w:pPr>
       <w:pStyle w:val="Footer"/>
@@ -3055,7 +3064,7 @@
 </file>
 
 <file path=word/footnotes.xml><?xml version="1.0" encoding="utf-8"?>
-<w:footnotes xmlns:wpc="http://schemas.microsoft.com/office/word/2010/wordprocessingCanvas" xmlns:cx="http://schemas.microsoft.com/office/drawing/2014/chartex" xmlns:cx1="http://schemas.microsoft.com/office/drawing/2015/9/8/chartex" xmlns:cx2="http://schemas.microsoft.com/office/drawing/2015/10/21/chartex" xmlns:cx3="http://schemas.microsoft.com/office/drawing/2016/5/9/chartex" xmlns:cx4="http://schemas.microsoft.com/office/drawing/2016/5/10/chartex" xmlns:cx5="http://schemas.microsoft.com/office/drawing/2016/5/11/chartex" xmlns:cx6="http://schemas.microsoft.com/office/drawing/2016/5/12/chartex" xmlns:cx7="http://schemas.microsoft.com/office/drawing/2016/5/13/chartex" xmlns:cx8="http://schemas.microsoft.com/office/drawing/2016/5/14/chartex" xmlns:mc="http://schemas.openxmlformats.org/markup-compatibility/2006" xmlns:aink="http://schemas.microsoft.com/office/drawing/2016/ink" xmlns:am3d="http://schemas.microsoft.com/office/drawing/2017/model3d" xmlns:o="urn:schemas-microsoft-com:office:office" xmlns:oel="http://schemas.microsoft.com/office/2019/extlst" xmlns:r="http://schemas.openxmlformats.org/officeDocument/2006/relationships" xmlns:m="http://schemas.openxmlformats.org/officeDocument/2006/math" xmlns:v="urn:schemas-microsoft-com:vml" xmlns:wp14="http://schemas.microsoft.com/office/word/2010/wordprocessingDrawing" xmlns:wp="http://schemas.openxmlformats.org/drawingml/2006/wordprocessingDrawing" xmlns:w10="urn:schemas-microsoft-com:office:word" xmlns:w="http://schemas.openxmlformats.org/wordprocessingml/2006/main" xmlns:w14="http://schemas.microsoft.com/office/word/2010/wordml" xmlns:w15="http://schemas.microsoft.com/office/word/2012/wordml" xmlns:w16cex="http://schemas.microsoft.com/office/word/2018/wordml/cex" xmlns:w16cid="http://schemas.microsoft.com/office/word/2016/wordml/cid" xmlns:w16="http://schemas.microsoft.com/office/word/2018/wordml" xmlns:w16du="http://schemas.microsoft.com/office/word/2023/wordml/word16du" xmlns:w16sdtdh="http://schemas.microsoft.com/office/word/2020/wordml/sdtdatahash" xmlns:w16sdtfl="http://schemas.microsoft.com/office/word/2024/wordml/sdtformatlock" xmlns:w16se="http://schemas.microsoft.com/office/word/2015/wordml/symex" xmlns:wpg="http://schemas.microsoft.com/office/word/2010/wordprocessingGroup" xmlns:wpi="http://schemas.microsoft.com/office/word/2010/wordprocessingInk" xmlns:wne="http://schemas.microsoft.com/office/word/2006/wordml" xmlns:wps="http://schemas.microsoft.com/office/word/2010/wordprocessingShape" mc:Ignorable="w14 w15 w16se w16cid w16 w16cex w16sdtdh w16sdtfl w16du wp14">
+<w:footnotes xmlns:wpc="http://schemas.microsoft.com/office/word/2010/wordprocessingCanvas" xmlns:cx="http://schemas.microsoft.com/office/drawing/2014/chartex" xmlns:cx1="http://schemas.microsoft.com/office/drawing/2015/9/8/chartex" xmlns:cx2="http://schemas.microsoft.com/office/drawing/2015/10/21/chartex" xmlns:cx3="http://schemas.microsoft.com/office/drawing/2016/5/9/chartex" xmlns:cx4="http://schemas.microsoft.com/office/drawing/2016/5/10/chartex" xmlns:cx5="http://schemas.microsoft.com/office/drawing/2016/5/11/chartex" xmlns:cx6="http://schemas.microsoft.com/office/drawing/2016/5/12/chartex" xmlns:cx7="http://schemas.microsoft.com/office/drawing/2016/5/13/chartex" xmlns:cx8="http://schemas.microsoft.com/office/drawing/2016/5/14/chartex" xmlns:mc="http://schemas.openxmlformats.org/markup-compatibility/2006" xmlns:aink="http://schemas.microsoft.com/office/drawing/2016/ink" xmlns:am3d="http://schemas.microsoft.com/office/drawing/2017/model3d" xmlns:o="urn:schemas-microsoft-com:office:office" xmlns:oel="http://schemas.microsoft.com/office/2019/extlst" xmlns:r="http://schemas.openxmlformats.org/officeDocument/2006/relationships" xmlns:m="http://schemas.openxmlformats.org/officeDocument/2006/math" xmlns:v="urn:schemas-microsoft-com:vml" xmlns:wp14="http://schemas.microsoft.com/office/word/2010/wordprocessingDrawing" xmlns:wp="http://schemas.openxmlformats.org/drawingml/2006/wordprocessingDrawing" xmlns:w10="urn:schemas-microsoft-com:office:word" xmlns:w="http://schemas.openxmlformats.org/wordprocessingml/2006/main" xmlns:w14="http://schemas.microsoft.com/office/word/2010/wordml" xmlns:w15="http://schemas.microsoft.com/office/word/2012/wordml" xmlns:w16cei="http://schemas.microsoft.com/office/word/2026/wordml/cei" xmlns:w16cex="http://schemas.microsoft.com/office/word/2018/wordml/cex" xmlns:w16cid="http://schemas.microsoft.com/office/word/2016/wordml/cid" xmlns:w16="http://schemas.microsoft.com/office/word/2018/wordml" xmlns:w16du="http://schemas.microsoft.com/office/word/2023/wordml/word16du" xmlns:w16sdtdh="http://schemas.microsoft.com/office/word/2020/wordml/sdtdatahash" xmlns:w16sdtfl="http://schemas.microsoft.com/office/word/2024/wordml/sdtformatlock" xmlns:w16se="http://schemas.microsoft.com/office/word/2015/wordml/symex" xmlns:wpg="http://schemas.microsoft.com/office/word/2010/wordprocessingGroup" xmlns:wpi="http://schemas.microsoft.com/office/word/2010/wordprocessingInk" xmlns:wne="http://schemas.microsoft.com/office/word/2006/wordml" xmlns:wps="http://schemas.microsoft.com/office/word/2010/wordprocessingShape" mc:Ignorable="w14 w15 w16se w16cid w16 w16cex w16sdtdh w16sdtfl w16du wp14">
   <w:footnote w:type="separator" w:id="-1">
     <w:p>
       <w:r>
@@ -3074,7 +3083,7 @@
 </file>
 
 <file path=word/header1.xml><?xml version="1.0" encoding="utf-8"?>
-<w:hdr xmlns:wpc="http://schemas.microsoft.com/office/word/2010/wordprocessingCanvas" xmlns:cx="http://schemas.microsoft.com/office/drawing/2014/chartex" xmlns:cx1="http://schemas.microsoft.com/office/drawing/2015/9/8/chartex" xmlns:cx2="http://schemas.microsoft.com/office/drawing/2015/10/21/chartex" xmlns:cx3="http://schemas.microsoft.com/office/drawing/2016/5/9/chartex" xmlns:cx4="http://schemas.microsoft.com/office/drawing/2016/5/10/chartex" xmlns:cx5="http://schemas.microsoft.com/office/drawing/2016/5/11/chartex" xmlns:cx6="http://schemas.microsoft.com/office/drawing/2016/5/12/chartex" xmlns:cx7="http://schemas.microsoft.com/office/drawing/2016/5/13/chartex" xmlns:cx8="http://schemas.microsoft.com/office/drawing/2016/5/14/chartex" xmlns:mc="http://schemas.openxmlformats.org/markup-compatibility/2006" xmlns:aink="http://schemas.microsoft.com/office/drawing/2016/ink" xmlns:am3d="http://schemas.microsoft.com/office/drawing/2017/model3d" xmlns:o="urn:schemas-microsoft-com:office:office" xmlns:oel="http://schemas.microsoft.com/office/2019/extlst" xmlns:r="http://schemas.openxmlformats.org/officeDocument/2006/relationships" xmlns:m="http://schemas.openxmlformats.org/officeDocument/2006/math" xmlns:v="urn:schemas-microsoft-com:vml" xmlns:wp14="http://schemas.microsoft.com/office/word/2010/wordprocessingDrawing" xmlns:wp="http://schemas.openxmlformats.org/drawingml/2006/wordprocessingDrawing" xmlns:w10="urn:schemas-microsoft-com:office:word" xmlns:w="http://schemas.openxmlformats.org/wordprocessingml/2006/main" xmlns:w14="http://schemas.microsoft.com/office/word/2010/wordml" xmlns:w15="http://schemas.microsoft.com/office/word/2012/wordml" xmlns:w16cex="http://schemas.microsoft.com/office/word/2018/wordml/cex" xmlns:w16cid="http://schemas.microsoft.com/office/word/2016/wordml/cid" xmlns:w16="http://schemas.microsoft.com/office/word/2018/wordml" xmlns:w16du="http://schemas.microsoft.com/office/word/2023/wordml/word16du" xmlns:w16sdtdh="http://schemas.microsoft.com/office/word/2020/wordml/sdtdatahash" xmlns:w16sdtfl="http://schemas.microsoft.com/office/word/2024/wordml/sdtformatlock" xmlns:w16se="http://schemas.microsoft.com/office/word/2015/wordml/symex" xmlns:wpg="http://schemas.microsoft.com/office/word/2010/wordprocessingGroup" xmlns:wpi="http://schemas.microsoft.com/office/word/2010/wordprocessingInk" xmlns:wne="http://schemas.microsoft.com/office/word/2006/wordml" xmlns:wps="http://schemas.microsoft.com/office/word/2010/wordprocessingShape" mc:Ignorable="w14 w15 w16se w16cid w16 w16cex w16sdtdh w16sdtfl w16du wp14">
+<w:hdr xmlns:wpc="http://schemas.microsoft.com/office/word/2010/wordprocessingCanvas" xmlns:cx="http://schemas.microsoft.com/office/drawing/2014/chartex" xmlns:cx1="http://schemas.microsoft.com/office/drawing/2015/9/8/chartex" xmlns:cx2="http://schemas.microsoft.com/office/drawing/2015/10/21/chartex" xmlns:cx3="http://schemas.microsoft.com/office/drawing/2016/5/9/chartex" xmlns:cx4="http://schemas.microsoft.com/office/drawing/2016/5/10/chartex" xmlns:cx5="http://schemas.microsoft.com/office/drawing/2016/5/11/chartex" xmlns:cx6="http://schemas.microsoft.com/office/drawing/2016/5/12/chartex" xmlns:cx7="http://schemas.microsoft.com/office/drawing/2016/5/13/chartex" xmlns:cx8="http://schemas.microsoft.com/office/drawing/2016/5/14/chartex" xmlns:mc="http://schemas.openxmlformats.org/markup-compatibility/2006" xmlns:aink="http://schemas.microsoft.com/office/drawing/2016/ink" xmlns:am3d="http://schemas.microsoft.com/office/drawing/2017/model3d" xmlns:o="urn:schemas-microsoft-com:office:office" xmlns:oel="http://schemas.microsoft.com/office/2019/extlst" xmlns:r="http://schemas.openxmlformats.org/officeDocument/2006/relationships" xmlns:m="http://schemas.openxmlformats.org/officeDocument/2006/math" xmlns:v="urn:schemas-microsoft-com:vml" xmlns:wp14="http://schemas.microsoft.com/office/word/2010/wordprocessingDrawing" xmlns:wp="http://schemas.openxmlformats.org/drawingml/2006/wordprocessingDrawing" xmlns:w10="urn:schemas-microsoft-com:office:word" xmlns:w="http://schemas.openxmlformats.org/wordprocessingml/2006/main" xmlns:w14="http://schemas.microsoft.com/office/word/2010/wordml" xmlns:w15="http://schemas.microsoft.com/office/word/2012/wordml" xmlns:w16cei="http://schemas.microsoft.com/office/word/2026/wordml/cei" xmlns:w16cex="http://schemas.microsoft.com/office/word/2018/wordml/cex" xmlns:w16cid="http://schemas.microsoft.com/office/word/2016/wordml/cid" xmlns:w16="http://schemas.microsoft.com/office/word/2018/wordml" xmlns:w16du="http://schemas.microsoft.com/office/word/2023/wordml/word16du" xmlns:w16sdtdh="http://schemas.microsoft.com/office/word/2020/wordml/sdtdatahash" xmlns:w16sdtfl="http://schemas.microsoft.com/office/word/2024/wordml/sdtformatlock" xmlns:w16se="http://schemas.microsoft.com/office/word/2015/wordml/symex" xmlns:wpg="http://schemas.microsoft.com/office/word/2010/wordprocessingGroup" xmlns:wpi="http://schemas.microsoft.com/office/word/2010/wordprocessingInk" xmlns:wne="http://schemas.microsoft.com/office/word/2006/wordml" xmlns:wps="http://schemas.microsoft.com/office/word/2010/wordprocessingShape" mc:Ignorable="w14 w15 w16se w16cid w16 w16cex w16sdtdh w16sdtfl w16du wp14">
   <w:p>
     <w:pPr>
       <w:pStyle w:val="Header"/>
@@ -3084,7 +3093,7 @@
 </file>
 
 <file path=word/header2.xml><?xml version="1.0" encoding="utf-8"?>
-<w:hdr xmlns:wpc="http://schemas.microsoft.com/office/word/2010/wordprocessingCanvas" xmlns:cx="http://schemas.microsoft.com/office/drawing/2014/chartex" xmlns:cx1="http://schemas.microsoft.com/office/drawing/2015/9/8/chartex" xmlns:cx2="http://schemas.microsoft.com/office/drawing/2015/10/21/chartex" xmlns:cx3="http://schemas.microsoft.com/office/drawing/2016/5/9/chartex" xmlns:cx4="http://schemas.microsoft.com/office/drawing/2016/5/10/chartex" xmlns:cx5="http://schemas.microsoft.com/office/drawing/2016/5/11/chartex" xmlns:cx6="http://schemas.microsoft.com/office/drawing/2016/5/12/chartex" xmlns:cx7="http://schemas.microsoft.com/office/drawing/2016/5/13/chartex" xmlns:cx8="http://schemas.microsoft.com/office/drawing/2016/5/14/chartex" xmlns:mc="http://schemas.openxmlformats.org/markup-compatibility/2006" xmlns:aink="http://schemas.microsoft.com/office/drawing/2016/ink" xmlns:am3d="http://schemas.microsoft.com/office/drawing/2017/model3d" xmlns:o="urn:schemas-microsoft-com:office:office" xmlns:oel="http://schemas.microsoft.com/office/2019/extlst" xmlns:r="http://schemas.openxmlformats.org/officeDocument/2006/relationships" xmlns:m="http://schemas.openxmlformats.org/officeDocument/2006/math" xmlns:v="urn:schemas-microsoft-com:vml" xmlns:wp14="http://schemas.microsoft.com/office/word/2010/wordprocessingDrawing" xmlns:wp="http://schemas.openxmlformats.org/drawingml/2006/wordprocessingDrawing" xmlns:w10="urn:schemas-microsoft-com:office:word" xmlns:w="http://schemas.openxmlformats.org/wordprocessingml/2006/main" xmlns:w14="http://schemas.microsoft.com/office/word/2010/wordml" xmlns:w15="http://schemas.microsoft.com/office/word/2012/wordml" xmlns:w16cex="http://schemas.microsoft.com/office/word/2018/wordml/cex" xmlns:w16cid="http://schemas.microsoft.com/office/word/2016/wordml/cid" xmlns:w16="http://schemas.microsoft.com/office/word/2018/wordml" xmlns:w16du="http://schemas.microsoft.com/office/word/2023/wordml/word16du" xmlns:w16sdtdh="http://schemas.microsoft.com/office/word/2020/wordml/sdtdatahash" xmlns:w16sdtfl="http://schemas.microsoft.com/office/word/2024/wordml/sdtformatlock" xmlns:w16se="http://schemas.microsoft.com/office/word/2015/wordml/symex" xmlns:wpg="http://schemas.microsoft.com/office/word/2010/wordprocessingGroup" xmlns:wpi="http://schemas.microsoft.com/office/word/2010/wordprocessingInk" xmlns:wne="http://schemas.microsoft.com/office/word/2006/wordml" xmlns:wps="http://schemas.microsoft.com/office/word/2010/wordprocessingShape" mc:Ignorable="w14 w15 w16se w16cid w16 w16cex w16sdtdh w16sdtfl w16du wp14">
+<w:hdr xmlns:wpc="http://schemas.microsoft.com/office/word/2010/wordprocessingCanvas" xmlns:cx="http://schemas.microsoft.com/office/drawing/2014/chartex" xmlns:cx1="http://schemas.microsoft.com/office/drawing/2015/9/8/chartex" xmlns:cx2="http://schemas.microsoft.com/office/drawing/2015/10/21/chartex" xmlns:cx3="http://schemas.microsoft.com/office/drawing/2016/5/9/chartex" xmlns:cx4="http://schemas.microsoft.com/office/drawing/2016/5/10/chartex" xmlns:cx5="http://schemas.microsoft.com/office/drawing/2016/5/11/chartex" xmlns:cx6="http://schemas.microsoft.com/office/drawing/2016/5/12/chartex" xmlns:cx7="http://schemas.microsoft.com/office/drawing/2016/5/13/chartex" xmlns:cx8="http://schemas.microsoft.com/office/drawing/2016/5/14/chartex" xmlns:mc="http://schemas.openxmlformats.org/markup-compatibility/2006" xmlns:aink="http://schemas.microsoft.com/office/drawing/2016/ink" xmlns:am3d="http://schemas.microsoft.com/office/drawing/2017/model3d" xmlns:o="urn:schemas-microsoft-com:office:office" xmlns:oel="http://schemas.microsoft.com/office/2019/extlst" xmlns:r="http://schemas.openxmlformats.org/officeDocument/2006/relationships" xmlns:m="http://schemas.openxmlformats.org/officeDocument/2006/math" xmlns:v="urn:schemas-microsoft-com:vml" xmlns:wp14="http://schemas.microsoft.com/office/word/2010/wordprocessingDrawing" xmlns:wp="http://schemas.openxmlformats.org/drawingml/2006/wordprocessingDrawing" xmlns:w10="urn:schemas-microsoft-com:office:word" xmlns:w="http://schemas.openxmlformats.org/wordprocessingml/2006/main" xmlns:w14="http://schemas.microsoft.com/office/word/2010/wordml" xmlns:w15="http://schemas.microsoft.com/office/word/2012/wordml" xmlns:w16cei="http://schemas.microsoft.com/office/word/2026/wordml/cei" xmlns:w16cex="http://schemas.microsoft.com/office/word/2018/wordml/cex" xmlns:w16cid="http://schemas.microsoft.com/office/word/2016/wordml/cid" xmlns:w16="http://schemas.microsoft.com/office/word/2018/wordml" xmlns:w16du="http://schemas.microsoft.com/office/word/2023/wordml/word16du" xmlns:w16sdtdh="http://schemas.microsoft.com/office/word/2020/wordml/sdtdatahash" xmlns:w16sdtfl="http://schemas.microsoft.com/office/word/2024/wordml/sdtformatlock" xmlns:w16se="http://schemas.microsoft.com/office/word/2015/wordml/symex" xmlns:wpg="http://schemas.microsoft.com/office/word/2010/wordprocessingGroup" xmlns:wpi="http://schemas.microsoft.com/office/word/2010/wordprocessingInk" xmlns:wne="http://schemas.microsoft.com/office/word/2006/wordml" xmlns:wps="http://schemas.microsoft.com/office/word/2010/wordprocessingShape" mc:Ignorable="w14 w15 w16se w16cid w16 w16cex w16sdtdh w16sdtfl w16du wp14">
   <w:p>
     <w:pPr>
       <w:pStyle w:val="Header"/>
@@ -3100,7 +3109,7 @@
 </file>
 
 <file path=word/header3.xml><?xml version="1.0" encoding="utf-8"?>
-<w:hdr xmlns:wpc="http://schemas.microsoft.com/office/word/2010/wordprocessingCanvas" xmlns:cx="http://schemas.microsoft.com/office/drawing/2014/chartex" xmlns:cx1="http://schemas.microsoft.com/office/drawing/2015/9/8/chartex" xmlns:cx2="http://schemas.microsoft.com/office/drawing/2015/10/21/chartex" xmlns:cx3="http://schemas.microsoft.com/office/drawing/2016/5/9/chartex" xmlns:cx4="http://schemas.microsoft.com/office/drawing/2016/5/10/chartex" xmlns:cx5="http://schemas.microsoft.com/office/drawing/2016/5/11/chartex" xmlns:cx6="http://schemas.microsoft.com/office/drawing/2016/5/12/chartex" xmlns:cx7="http://schemas.microsoft.com/office/drawing/2016/5/13/chartex" xmlns:cx8="http://schemas.microsoft.com/office/drawing/2016/5/14/chartex" xmlns:mc="http://schemas.openxmlformats.org/markup-compatibility/2006" xmlns:aink="http://schemas.microsoft.com/office/drawing/2016/ink" xmlns:am3d="http://schemas.microsoft.com/office/drawing/2017/model3d" xmlns:o="urn:schemas-microsoft-com:office:office" xmlns:oel="http://schemas.microsoft.com/office/2019/extlst" xmlns:r="http://schemas.openxmlformats.org/officeDocument/2006/relationships" xmlns:m="http://schemas.openxmlformats.org/officeDocument/2006/math" xmlns:v="urn:schemas-microsoft-com:vml" xmlns:wp14="http://schemas.microsoft.com/office/word/2010/wordprocessingDrawing" xmlns:wp="http://schemas.openxmlformats.org/drawingml/2006/wordprocessingDrawing" xmlns:w10="urn:schemas-microsoft-com:office:word" xmlns:w="http://schemas.openxmlformats.org/wordprocessingml/2006/main" xmlns:w14="http://schemas.microsoft.com/office/word/2010/wordml" xmlns:w15="http://schemas.microsoft.com/office/word/2012/wordml" xmlns:w16cex="http://schemas.microsoft.com/office/word/2018/wordml/cex" xmlns:w16cid="http://schemas.microsoft.com/office/word/2016/wordml/cid" xmlns:w16="http://schemas.microsoft.com/office/word/2018/wordml" xmlns:w16du="http://schemas.microsoft.com/office/word/2023/wordml/word16du" xmlns:w16sdtdh="http://schemas.microsoft.com/office/word/2020/wordml/sdtdatahash" xmlns:w16sdtfl="http://schemas.microsoft.com/office/word/2024/wordml/sdtformatlock" xmlns:w16se="http://schemas.microsoft.com/office/word/2015/wordml/symex" xmlns:wpg="http://schemas.microsoft.com/office/word/2010/wordprocessingGroup" xmlns:wpi="http://schemas.microsoft.com/office/word/2010/wordprocessingInk" xmlns:wne="http://schemas.microsoft.com/office/word/2006/wordml" xmlns:wps="http://schemas.microsoft.com/office/word/2010/wordprocessingShape" mc:Ignorable="w14 w15 w16se w16cid w16 w16cex w16sdtdh w16sdtfl w16du wp14">
+<w:hdr xmlns:wpc="http://schemas.microsoft.com/office/word/2010/wordprocessingCanvas" xmlns:cx="http://schemas.microsoft.com/office/drawing/2014/chartex" xmlns:cx1="http://schemas.microsoft.com/office/drawing/2015/9/8/chartex" xmlns:cx2="http://schemas.microsoft.com/office/drawing/2015/10/21/chartex" xmlns:cx3="http://schemas.microsoft.com/office/drawing/2016/5/9/chartex" xmlns:cx4="http://schemas.microsoft.com/office/drawing/2016/5/10/chartex" xmlns:cx5="http://schemas.microsoft.com/office/drawing/2016/5/11/chartex" xmlns:cx6="http://schemas.microsoft.com/office/drawing/2016/5/12/chartex" xmlns:cx7="http://schemas.microsoft.com/office/drawing/2016/5/13/chartex" xmlns:cx8="http://schemas.microsoft.com/office/drawing/2016/5/14/chartex" xmlns:mc="http://schemas.openxmlformats.org/markup-compatibility/2006" xmlns:aink="http://schemas.microsoft.com/office/drawing/2016/ink" xmlns:am3d="http://schemas.microsoft.com/office/drawing/2017/model3d" xmlns:o="urn:schemas-microsoft-com:office:office" xmlns:oel="http://schemas.microsoft.com/office/2019/extlst" xmlns:r="http://schemas.openxmlformats.org/officeDocument/2006/relationships" xmlns:m="http://schemas.openxmlformats.org/officeDocument/2006/math" xmlns:v="urn:schemas-microsoft-com:vml" xmlns:wp14="http://schemas.microsoft.com/office/word/2010/wordprocessingDrawing" xmlns:wp="http://schemas.openxmlformats.org/drawingml/2006/wordprocessingDrawing" xmlns:w10="urn:schemas-microsoft-com:office:word" xmlns:w="http://schemas.openxmlformats.org/wordprocessingml/2006/main" xmlns:w14="http://schemas.microsoft.com/office/word/2010/wordml" xmlns:w15="http://schemas.microsoft.com/office/word/2012/wordml" xmlns:w16cei="http://schemas.microsoft.com/office/word/2026/wordml/cei" xmlns:w16cex="http://schemas.microsoft.com/office/word/2018/wordml/cex" xmlns:w16cid="http://schemas.microsoft.com/office/word/2016/wordml/cid" xmlns:w16="http://schemas.microsoft.com/office/word/2018/wordml" xmlns:w16du="http://schemas.microsoft.com/office/word/2023/wordml/word16du" xmlns:w16sdtdh="http://schemas.microsoft.com/office/word/2020/wordml/sdtdatahash" xmlns:w16sdtfl="http://schemas.microsoft.com/office/word/2024/wordml/sdtformatlock" xmlns:w16se="http://schemas.microsoft.com/office/word/2015/wordml/symex" xmlns:wpg="http://schemas.microsoft.com/office/word/2010/wordprocessingGroup" xmlns:wpi="http://schemas.microsoft.com/office/word/2010/wordprocessingInk" xmlns:wne="http://schemas.microsoft.com/office/word/2006/wordml" xmlns:wps="http://schemas.microsoft.com/office/word/2010/wordprocessingShape" mc:Ignorable="w14 w15 w16se w16cid w16 w16cex w16sdtdh w16sdtfl w16du wp14">
   <w:p>
     <w:pPr>
       <w:pStyle w:val="Header"/>
@@ -3110,7 +3119,7 @@
 </file>
 
 <file path=word/numbering.xml><?xml version="1.0" encoding="utf-8"?>
-<w:numbering xmlns:wpc="http://schemas.microsoft.com/office/word/2010/wordprocessingCanvas" xmlns:cx="http://schemas.microsoft.com/office/drawing/2014/chartex" xmlns:cx1="http://schemas.microsoft.com/office/drawing/2015/9/8/chartex" xmlns:cx2="http://schemas.microsoft.com/office/drawing/2015/10/21/chartex" xmlns:cx3="http://schemas.microsoft.com/office/drawing/2016/5/9/chartex" xmlns:cx4="http://schemas.microsoft.com/office/drawing/2016/5/10/chartex" xmlns:cx5="http://schemas.microsoft.com/office/drawing/2016/5/11/chartex" xmlns:cx6="http://schemas.microsoft.com/office/drawing/2016/5/12/chartex" xmlns:cx7="http://schemas.microsoft.com/office/drawing/2016/5/13/chartex" xmlns:cx8="http://schemas.microsoft.com/office/drawing/2016/5/14/chartex" xmlns:mc="http://schemas.openxmlformats.org/markup-compatibility/2006" xmlns:aink="http://schemas.microsoft.com/office/drawing/2016/ink" xmlns:am3d="http://schemas.microsoft.com/office/drawing/2017/model3d" xmlns:o="urn:schemas-microsoft-com:office:office" xmlns:oel="http://schemas.microsoft.com/office/2019/extlst" xmlns:r="http://schemas.openxmlformats.org/officeDocument/2006/relationships" xmlns:m="http://schemas.openxmlformats.org/officeDocument/2006/math" xmlns:v="urn:schemas-microsoft-com:vml" xmlns:wp14="http://schemas.microsoft.com/office/word/2010/wordprocessingDrawing" xmlns:wp="http://schemas.openxmlformats.org/drawingml/2006/wordprocessingDrawing" xmlns:w10="urn:schemas-microsoft-com:office:word" xmlns:w="http://schemas.openxmlformats.org/wordprocessingml/2006/main" xmlns:w14="http://schemas.microsoft.com/office/word/2010/wordml" xmlns:w15="http://schemas.microsoft.com/office/word/2012/wordml" xmlns:w16cex="http://schemas.microsoft.com/office/word/2018/wordml/cex" xmlns:w16cid="http://schemas.microsoft.com/office/word/2016/wordml/cid" xmlns:w16="http://schemas.microsoft.com/office/word/2018/wordml" xmlns:w16du="http://schemas.microsoft.com/office/word/2023/wordml/word16du" xmlns:w16sdtdh="http://schemas.microsoft.com/office/word/2020/wordml/sdtdatahash" xmlns:w16sdtfl="http://schemas.microsoft.com/office/word/2024/wordml/sdtformatlock" xmlns:w16se="http://schemas.microsoft.com/office/word/2015/wordml/symex" xmlns:wpg="http://schemas.microsoft.com/office/word/2010/wordprocessingGroup" xmlns:wpi="http://schemas.microsoft.com/office/word/2010/wordprocessingInk" xmlns:wne="http://schemas.microsoft.com/office/word/2006/wordml" xmlns:wps="http://schemas.microsoft.com/office/word/2010/wordprocessingShape" mc:Ignorable="w14 w15 w16se w16cid w16 w16cex w16sdtdh w16sdtfl w16du wp14">
+<w:numbering xmlns:wpc="http://schemas.microsoft.com/office/word/2010/wordprocessingCanvas" xmlns:cx="http://schemas.microsoft.com/office/drawing/2014/chartex" xmlns:cx1="http://schemas.microsoft.com/office/drawing/2015/9/8/chartex" xmlns:cx2="http://schemas.microsoft.com/office/drawing/2015/10/21/chartex" xmlns:cx3="http://schemas.microsoft.com/office/drawing/2016/5/9/chartex" xmlns:cx4="http://schemas.microsoft.com/office/drawing/2016/5/10/chartex" xmlns:cx5="http://schemas.microsoft.com/office/drawing/2016/5/11/chartex" xmlns:cx6="http://schemas.microsoft.com/office/drawing/2016/5/12/chartex" xmlns:cx7="http://schemas.microsoft.com/office/drawing/2016/5/13/chartex" xmlns:cx8="http://schemas.microsoft.com/office/drawing/2016/5/14/chartex" xmlns:mc="http://schemas.openxmlformats.org/markup-compatibility/2006" xmlns:aink="http://schemas.microsoft.com/office/drawing/2016/ink" xmlns:am3d="http://schemas.microsoft.com/office/drawing/2017/model3d" xmlns:o="urn:schemas-microsoft-com:office:office" xmlns:oel="http://schemas.microsoft.com/office/2019/extlst" xmlns:r="http://schemas.openxmlformats.org/officeDocument/2006/relationships" xmlns:m="http://schemas.openxmlformats.org/officeDocument/2006/math" xmlns:v="urn:schemas-microsoft-com:vml" xmlns:wp14="http://schemas.microsoft.com/office/word/2010/wordprocessingDrawing" xmlns:wp="http://schemas.openxmlformats.org/drawingml/2006/wordprocessingDrawing" xmlns:w10="urn:schemas-microsoft-com:office:word" xmlns:w="http://schemas.openxmlformats.org/wordprocessingml/2006/main" xmlns:w14="http://schemas.microsoft.com/office/word/2010/wordml" xmlns:w15="http://schemas.microsoft.com/office/word/2012/wordml" xmlns:w16cei="http://schemas.microsoft.com/office/word/2026/wordml/cei" xmlns:w16cex="http://schemas.microsoft.com/office/word/2018/wordml/cex" xmlns:w16cid="http://schemas.microsoft.com/office/word/2016/wordml/cid" xmlns:w16="http://schemas.microsoft.com/office/word/2018/wordml" xmlns:w16du="http://schemas.microsoft.com/office/word/2023/wordml/word16du" xmlns:w16sdtdh="http://schemas.microsoft.com/office/word/2020/wordml/sdtdatahash" xmlns:w16sdtfl="http://schemas.microsoft.com/office/word/2024/wordml/sdtformatlock" xmlns:w16se="http://schemas.microsoft.com/office/word/2015/wordml/symex" xmlns:wpg="http://schemas.microsoft.com/office/word/2010/wordprocessingGroup" xmlns:wpi="http://schemas.microsoft.com/office/word/2010/wordprocessingInk" xmlns:wne="http://schemas.microsoft.com/office/word/2006/wordml" xmlns:wps="http://schemas.microsoft.com/office/word/2010/wordprocessingShape" mc:Ignorable="w14 w15 w16se w16cid w16 w16cex w16sdtdh w16sdtfl w16du wp14">
   <w:abstractNum w:abstractNumId="0" w15:restartNumberingAfterBreak="0">
     <w:nsid w:val="01164B5E"/>
     <w:multiLevelType w:val="hybridMultilevel"/>

</xml_diff>

<commit_message>
Bump all modules from v4.5.0 to v4.6.0
Renames all module files from v4.5.0 to v4.6.0. Key changes include:
- Camera: adds RtspStreamUrl string output and its change callback
- Core: adds delay(10) to all busy-wait loops to prevent CPU spinning
- Updated compiled zips, .clz, .umc, .ush files, help docs, and test files
</commit_message>
<xml_diff>
--- a/SIMPL/Qsys Core Help File.docx
+++ b/SIMPL/Qsys Core Help File.docx
@@ -260,7 +260,16 @@
                 <w:sz w:val="15"/>
                 <w:szCs w:val="24"/>
               </w:rPr>
-              <w:t>5.0</w:t>
+              <w:t>6</w:t>
+            </w:r>
+            <w:r>
+              <w:rPr>
+                <w:rFonts w:ascii="Verdana" w:hAnsi="Verdana"/>
+                <w:color w:val="000000"/>
+                <w:sz w:val="15"/>
+                <w:szCs w:val="24"/>
+              </w:rPr>
+              <w:t>.0</w:t>
             </w:r>
           </w:p>
         </w:tc>

</xml_diff>

<commit_message>
Release Qsys modules v4.6.1 with init sync
Bumps the Qsys module/SIMPL package set from v4.6.0 to v4.6.1, including renamed versioned artifacts and updated compiled binaries/help files. The Core USP now synchronizes initialization with property writes (mutex/event + init write counter) so `Initialize` waits for pending IP/port/credential updates before connecting.
</commit_message>
<xml_diff>
--- a/SIMPL/Qsys Core Help File.docx
+++ b/SIMPL/Qsys Core Help File.docx
@@ -269,7 +269,16 @@
                 <w:sz w:val="15"/>
                 <w:szCs w:val="24"/>
               </w:rPr>
-              <w:t>.0</w:t>
+              <w:t>.</w:t>
+            </w:r>
+            <w:r>
+              <w:rPr>
+                <w:rFonts w:ascii="Verdana" w:hAnsi="Verdana"/>
+                <w:color w:val="000000"/>
+                <w:sz w:val="15"/>
+                <w:szCs w:val="24"/>
+              </w:rPr>
+              <w:t>1</w:t>
             </w:r>
           </w:p>
         </w:tc>

</xml_diff>